<commit_message>
Move updated resume into the linked resume folder
The latest resume was added under src/assets, but the site's Resume
buttons link to assets/resume, so visitors still got the old version.

- Replace src/assets/resume/Resume_Megha_Kaul.pdf with the new version
- Replace src/assets/resume/Resume_Megha_Kaul.docx with the new version
</commit_message>
<xml_diff>
--- a/src/assets/resume/Resume_Megha_Kaul.docx
+++ b/src/assets/resume/Resume_Megha_Kaul.docx
@@ -212,27 +212,7 @@
             <w:szCs w:val="18"/>
             <w:u w:val="none"/>
           </w:rPr>
-          <w:t>linkedin.co</w:t>
-        </w:r>
-        <w:r>
-          <w:rPr>
-            <w:rStyle w:val="Hyperlink"/>
-            <w:color w:val="000000" w:themeColor="text1"/>
-            <w:sz w:val="18"/>
-            <w:szCs w:val="18"/>
-            <w:u w:val="none"/>
-          </w:rPr>
-          <w:t>m</w:t>
-        </w:r>
-        <w:r>
-          <w:rPr>
-            <w:rStyle w:val="Hyperlink"/>
-            <w:color w:val="000000" w:themeColor="text1"/>
-            <w:sz w:val="18"/>
-            <w:szCs w:val="18"/>
-            <w:u w:val="none"/>
-          </w:rPr>
-          <w:t>/in/</w:t>
+          <w:t>linkedin.com/in/</w:t>
         </w:r>
         <w:proofErr w:type="spellStart"/>
         <w:r>
@@ -1203,7 +1183,21 @@
           <w:sz w:val="22"/>
           <w:szCs w:val="22"/>
         </w:rPr>
-        <w:t xml:space="preserve">Owned and prioritized the product backlog using </w:t>
+        <w:t xml:space="preserve">Chartered GEP's Ontology Data Product, a governed semantic layer with standardized definitions and data trust scoring, </w:t>
+      </w:r>
+      <w:r>
+        <w:rPr>
+          <w:sz w:val="22"/>
+          <w:szCs w:val="22"/>
+        </w:rPr>
+        <w:t>uncover</w:t>
+      </w:r>
+      <w:r>
+        <w:rPr>
+          <w:sz w:val="22"/>
+          <w:szCs w:val="22"/>
+        </w:rPr>
+        <w:t>ing</w:t>
       </w:r>
       <w:r>
         <w:rPr>
@@ -1212,7 +1206,35 @@
           <w:sz w:val="22"/>
           <w:szCs w:val="22"/>
         </w:rPr>
-        <w:t>customer feedback, telemetry, and operational insights</w:t>
+        <w:t xml:space="preserve"> </w:t>
+      </w:r>
+      <w:r>
+        <w:rPr>
+          <w:sz w:val="22"/>
+          <w:szCs w:val="22"/>
+        </w:rPr>
+        <w:t>$</w:t>
+      </w:r>
+      <w:r>
+        <w:rPr>
+          <w:sz w:val="22"/>
+          <w:szCs w:val="22"/>
+        </w:rPr>
+        <w:t>20</w:t>
+      </w:r>
+      <w:r>
+        <w:rPr>
+          <w:sz w:val="22"/>
+          <w:szCs w:val="22"/>
+        </w:rPr>
+        <w:t xml:space="preserve">M </w:t>
+      </w:r>
+      <w:r>
+        <w:rPr>
+          <w:sz w:val="22"/>
+          <w:szCs w:val="22"/>
+        </w:rPr>
+        <w:t>in spend leakage</w:t>
       </w:r>
       <w:r>
         <w:rPr>
@@ -1222,6 +1244,15 @@
           <w:szCs w:val="22"/>
         </w:rPr>
         <w:t>.</w:t>
+      </w:r>
+      <w:r>
+        <w:rPr>
+          <w:b w:val="0"/>
+          <w:bCs w:val="0"/>
+          <w:sz w:val="22"/>
+          <w:szCs w:val="22"/>
+        </w:rPr>
+        <w:t>  </w:t>
       </w:r>
     </w:p>
     <w:p>
@@ -1248,7 +1279,14 @@
           <w:sz w:val="22"/>
           <w:szCs w:val="22"/>
         </w:rPr>
-        <w:t>D</w:t>
+        <w:t xml:space="preserve">Led the shift from descriptive dashboards to AI agent-orchestrated, prescriptive analytics that recommend next-best actions, integrating </w:t>
+      </w:r>
+      <w:r>
+        <w:rPr>
+          <w:sz w:val="22"/>
+          <w:szCs w:val="22"/>
+        </w:rPr>
+        <w:t>Databricks Genie</w:t>
       </w:r>
       <w:r>
         <w:rPr>
@@ -1257,39 +1295,14 @@
           <w:sz w:val="22"/>
           <w:szCs w:val="22"/>
         </w:rPr>
-        <w:t>eliver</w:t>
-      </w:r>
-      <w:r>
-        <w:rPr>
-          <w:b w:val="0"/>
-          <w:bCs w:val="0"/>
-          <w:sz w:val="22"/>
-          <w:szCs w:val="22"/>
-        </w:rPr>
-        <w:t>ed</w:t>
-      </w:r>
-      <w:r>
-        <w:rPr>
-          <w:sz w:val="22"/>
-          <w:szCs w:val="22"/>
-        </w:rPr>
-        <w:t xml:space="preserve"> </w:t>
-      </w:r>
-      <w:r>
-        <w:rPr>
-          <w:sz w:val="22"/>
-          <w:szCs w:val="22"/>
-        </w:rPr>
-        <w:t>20+ features</w:t>
-      </w:r>
-      <w:r>
-        <w:rPr>
-          <w:b w:val="0"/>
-          <w:bCs w:val="0"/>
-          <w:sz w:val="22"/>
-          <w:szCs w:val="22"/>
-        </w:rPr>
-        <w:t xml:space="preserve"> and platform improvements through release cycles that reduced support issues by 30%.</w:t>
+        <w:t xml:space="preserve"> to reduce query turnaround time by </w:t>
+      </w:r>
+      <w:r>
+        <w:rPr>
+          <w:sz w:val="22"/>
+          <w:szCs w:val="22"/>
+        </w:rPr>
+        <w:t>50%.</w:t>
       </w:r>
     </w:p>
     <w:p>
@@ -1303,12 +1316,26 @@
         <w:ind w:left="273" w:hanging="187"/>
         <w:jc w:val="both"/>
         <w:rPr>
+          <w:kern w:val="2"/>
+          <w14:ligatures w14:val="standardContextual"/>
+        </w:rPr>
+      </w:pPr>
+      <w:r>
+        <w:rPr>
           <w:b w:val="0"/>
           <w:bCs w:val="0"/>
           <w:sz w:val="22"/>
           <w:szCs w:val="22"/>
         </w:rPr>
-      </w:pPr>
+        <w:t xml:space="preserve">Led launch and market adoption of GEP’s multi-tenant analytics platform with Data Access Control framework, driving </w:t>
+      </w:r>
+      <w:r>
+        <w:rPr>
+          <w:sz w:val="22"/>
+          <w:szCs w:val="22"/>
+        </w:rPr>
+        <w:t>$1.2M incremental revenue</w:t>
+      </w:r>
       <w:r>
         <w:rPr>
           <w:b w:val="0"/>
@@ -1316,7 +1343,30 @@
           <w:sz w:val="22"/>
           <w:szCs w:val="22"/>
         </w:rPr>
-        <w:t>Led launch and market adoption of GEP’s multi-tenant analytics platform with Data Access Control framework, driving $1.2M incremental revenue, reducing customer onboarding time by 35%, and improving platform adoption by 25%.</w:t>
+        <w:t xml:space="preserve">, reducing customer onboarding time </w:t>
+      </w:r>
+      <w:r>
+        <w:rPr>
+          <w:sz w:val="22"/>
+          <w:szCs w:val="22"/>
+        </w:rPr>
+        <w:t>by 35%</w:t>
+      </w:r>
+      <w:r>
+        <w:rPr>
+          <w:b w:val="0"/>
+          <w:bCs w:val="0"/>
+          <w:sz w:val="22"/>
+          <w:szCs w:val="22"/>
+        </w:rPr>
+        <w:t xml:space="preserve">, and improving platform adoption </w:t>
+      </w:r>
+      <w:r>
+        <w:rPr>
+          <w:sz w:val="22"/>
+          <w:szCs w:val="22"/>
+        </w:rPr>
+        <w:t>by 25%.</w:t>
       </w:r>
     </w:p>
     <w:p>
@@ -1343,14 +1393,7 @@
           <w:sz w:val="22"/>
           <w:szCs w:val="22"/>
         </w:rPr>
-        <w:t xml:space="preserve">Shipped an </w:t>
-      </w:r>
-      <w:r>
-        <w:rPr>
-          <w:sz w:val="22"/>
-          <w:szCs w:val="22"/>
-        </w:rPr>
-        <w:t>AI-powered analytics chatbot</w:t>
+        <w:t>D</w:t>
       </w:r>
       <w:r>
         <w:rPr>
@@ -1359,14 +1402,7 @@
           <w:sz w:val="22"/>
           <w:szCs w:val="22"/>
         </w:rPr>
-        <w:t xml:space="preserve"> using </w:t>
-      </w:r>
-      <w:r>
-        <w:rPr>
-          <w:sz w:val="22"/>
-          <w:szCs w:val="22"/>
-        </w:rPr>
-        <w:t>prompt engineering</w:t>
+        <w:t>eliver</w:t>
       </w:r>
       <w:r>
         <w:rPr>
@@ -1375,14 +1411,21 @@
           <w:sz w:val="22"/>
           <w:szCs w:val="22"/>
         </w:rPr>
-        <w:t xml:space="preserve">, expanding active user base </w:t>
-      </w:r>
-      <w:r>
-        <w:rPr>
-          <w:sz w:val="22"/>
-          <w:szCs w:val="22"/>
-        </w:rPr>
-        <w:t>by 15% (100+ users)</w:t>
+        <w:t>ed</w:t>
+      </w:r>
+      <w:r>
+        <w:rPr>
+          <w:sz w:val="22"/>
+          <w:szCs w:val="22"/>
+        </w:rPr>
+        <w:t xml:space="preserve"> </w:t>
+      </w:r>
+      <w:r>
+        <w:rPr>
+          <w:sz w:val="22"/>
+          <w:szCs w:val="22"/>
+        </w:rPr>
+        <w:t>20+ features</w:t>
       </w:r>
       <w:r>
         <w:rPr>
@@ -1391,7 +1434,14 @@
           <w:sz w:val="22"/>
           <w:szCs w:val="22"/>
         </w:rPr>
-        <w:t xml:space="preserve"> and increasing self-service analytics adoption across business teams.</w:t>
+        <w:t xml:space="preserve"> and platform improvements through release cycles that </w:t>
+      </w:r>
+      <w:r>
+        <w:rPr>
+          <w:sz w:val="22"/>
+          <w:szCs w:val="22"/>
+        </w:rPr>
+        <w:t>reduced support issues by 30%.</w:t>
       </w:r>
     </w:p>
     <w:p>
@@ -1413,6 +1463,8 @@
       </w:pPr>
       <w:r>
         <w:rPr>
+          <w:b w:val="0"/>
+          <w:bCs w:val="0"/>
           <w:sz w:val="22"/>
           <w:szCs w:val="22"/>
         </w:rPr>
@@ -1420,6 +1472,8 @@
       </w:r>
       <w:r>
         <w:rPr>
+          <w:b w:val="0"/>
+          <w:bCs w:val="0"/>
           <w:sz w:val="22"/>
           <w:szCs w:val="22"/>
         </w:rPr>
@@ -1427,10 +1481,28 @@
       </w:r>
       <w:r>
         <w:rPr>
-          <w:sz w:val="22"/>
-          <w:szCs w:val="22"/>
-        </w:rPr>
-        <w:t>batch/real-time data ingestion strategies using Kafka</w:t>
+          <w:b w:val="0"/>
+          <w:bCs w:val="0"/>
+          <w:sz w:val="22"/>
+          <w:szCs w:val="22"/>
+        </w:rPr>
+        <w:t>batch/real-time data ingestion strategies using</w:t>
+      </w:r>
+      <w:r>
+        <w:rPr>
+          <w:sz w:val="22"/>
+          <w:szCs w:val="22"/>
+        </w:rPr>
+        <w:t xml:space="preserve"> </w:t>
+      </w:r>
+      <w:r>
+        <w:rPr>
+          <w:b w:val="0"/>
+          <w:bCs w:val="0"/>
+          <w:sz w:val="22"/>
+          <w:szCs w:val="22"/>
+        </w:rPr>
+        <w:t>Kafka</w:t>
       </w:r>
       <w:r>
         <w:rPr>
@@ -1514,14 +1586,28 @@
           <w:sz w:val="22"/>
           <w:szCs w:val="22"/>
         </w:rPr>
-        <w:t xml:space="preserve">Owned requirements and prioritization for Databricks Genie integration, enabling conversational reporting, improving query turnaround time by </w:t>
-      </w:r>
-      <w:r>
-        <w:rPr>
-          <w:sz w:val="22"/>
-          <w:szCs w:val="22"/>
-        </w:rPr>
-        <w:t>50%,</w:t>
+        <w:t xml:space="preserve">Drove adoption and customer success via onboarding, enablement, and in-product guidance, </w:t>
+      </w:r>
+      <w:r>
+        <w:rPr>
+          <w:sz w:val="22"/>
+          <w:szCs w:val="22"/>
+        </w:rPr>
+        <w:t>sustaining NPS &gt;</w:t>
+      </w:r>
+      <w:r>
+        <w:rPr>
+          <w:sz w:val="22"/>
+          <w:szCs w:val="22"/>
+        </w:rPr>
+        <w:t xml:space="preserve"> </w:t>
+      </w:r>
+      <w:r>
+        <w:rPr>
+          <w:sz w:val="22"/>
+          <w:szCs w:val="22"/>
+        </w:rPr>
+        <w:t>80</w:t>
       </w:r>
       <w:r>
         <w:rPr>
@@ -1530,7 +1616,7 @@
           <w:sz w:val="22"/>
           <w:szCs w:val="22"/>
         </w:rPr>
-        <w:t xml:space="preserve"> and maintaining performance, security, and platform reliability at scale.</w:t>
+        <w:t>.</w:t>
       </w:r>
     </w:p>
     <w:p>
@@ -1557,37 +1643,7 @@
           <w:sz w:val="22"/>
           <w:szCs w:val="22"/>
         </w:rPr>
-        <w:t xml:space="preserve">Drove adoption and customer success via onboarding, enablement, and in-product guidance, </w:t>
-      </w:r>
-      <w:r>
-        <w:rPr>
-          <w:sz w:val="22"/>
-          <w:szCs w:val="22"/>
-        </w:rPr>
-        <w:t>sustaining NPS &gt;</w:t>
-      </w:r>
-      <w:r>
-        <w:rPr>
-          <w:sz w:val="22"/>
-          <w:szCs w:val="22"/>
-        </w:rPr>
-        <w:t xml:space="preserve"> </w:t>
-      </w:r>
-      <w:r>
-        <w:rPr>
-          <w:sz w:val="22"/>
-          <w:szCs w:val="22"/>
-        </w:rPr>
-        <w:t>80</w:t>
-      </w:r>
-      <w:r>
-        <w:rPr>
-          <w:b w:val="0"/>
-          <w:bCs w:val="0"/>
-          <w:sz w:val="22"/>
-          <w:szCs w:val="22"/>
-        </w:rPr>
-        <w:t>.</w:t>
+        <w:t>Owned and prioritized the product backlog using customer feedback, telemetry, and operational insights.</w:t>
       </w:r>
     </w:p>
     <w:p>
@@ -1614,23 +1670,14 @@
           <w:sz w:val="22"/>
           <w:szCs w:val="22"/>
         </w:rPr>
-        <w:t xml:space="preserve">Replaced legacy reporting workflows with self-service and AI-powered analytics capabilities, reducing reliance on traditional reporting tools </w:t>
-      </w:r>
-      <w:r>
-        <w:rPr>
-          <w:sz w:val="22"/>
-          <w:szCs w:val="22"/>
-        </w:rPr>
-        <w:t>by 70%</w:t>
-      </w:r>
-      <w:r>
-        <w:rPr>
-          <w:b w:val="0"/>
-          <w:bCs w:val="0"/>
-          <w:sz w:val="22"/>
-          <w:szCs w:val="22"/>
-        </w:rPr>
-        <w:t xml:space="preserve"> and shifting enterprise users toward platform-based analytics adoption.</w:t>
+        <w:t xml:space="preserve">Replaced legacy reporting with AI-powered self-service analytics, </w:t>
+      </w:r>
+      <w:r>
+        <w:rPr>
+          <w:sz w:val="22"/>
+          <w:szCs w:val="22"/>
+        </w:rPr>
+        <w:t>reducing tool reliance by 70%.</w:t>
       </w:r>
     </w:p>
     <w:p>
@@ -4633,6 +4680,165 @@
       <w:szCs w:val="20"/>
     </w:rPr>
   </w:style>
+  <w:style w:type="paragraph" w:styleId="Heading3">
+    <w:name w:val="heading 3"/>
+    <w:basedOn w:val="Normal"/>
+    <w:next w:val="Normal"/>
+    <w:link w:val="Heading3Char"/>
+    <w:uiPriority w:val="9"/>
+    <w:semiHidden/>
+    <w:unhideWhenUsed/>
+    <w:qFormat/>
+    <w:rsid w:val="008B47AC"/>
+    <w:pPr>
+      <w:keepNext/>
+      <w:keepLines/>
+      <w:spacing w:before="40"/>
+      <w:outlineLvl w:val="2"/>
+    </w:pPr>
+    <w:rPr>
+      <w:rFonts w:asciiTheme="majorHAnsi" w:eastAsiaTheme="majorEastAsia" w:hAnsiTheme="majorHAnsi" w:cstheme="majorBidi"/>
+      <w:color w:val="243F60" w:themeColor="accent1" w:themeShade="7F"/>
+      <w:sz w:val="24"/>
+      <w:szCs w:val="24"/>
+    </w:rPr>
+  </w:style>
+  <w:style w:type="paragraph" w:styleId="Heading4">
+    <w:name w:val="heading 4"/>
+    <w:basedOn w:val="Normal"/>
+    <w:next w:val="Normal"/>
+    <w:link w:val="Heading4Char"/>
+    <w:uiPriority w:val="9"/>
+    <w:semiHidden/>
+    <w:unhideWhenUsed/>
+    <w:qFormat/>
+    <w:rsid w:val="008B47AC"/>
+    <w:pPr>
+      <w:keepNext/>
+      <w:keepLines/>
+      <w:spacing w:before="40"/>
+      <w:outlineLvl w:val="3"/>
+    </w:pPr>
+    <w:rPr>
+      <w:rFonts w:asciiTheme="majorHAnsi" w:eastAsiaTheme="majorEastAsia" w:hAnsiTheme="majorHAnsi" w:cstheme="majorBidi"/>
+      <w:i/>
+      <w:iCs/>
+      <w:color w:val="365F91" w:themeColor="accent1" w:themeShade="BF"/>
+    </w:rPr>
+  </w:style>
+  <w:style w:type="paragraph" w:styleId="Heading5">
+    <w:name w:val="heading 5"/>
+    <w:basedOn w:val="Normal"/>
+    <w:next w:val="Normal"/>
+    <w:link w:val="Heading5Char"/>
+    <w:uiPriority w:val="9"/>
+    <w:semiHidden/>
+    <w:unhideWhenUsed/>
+    <w:qFormat/>
+    <w:rsid w:val="008B47AC"/>
+    <w:pPr>
+      <w:keepNext/>
+      <w:keepLines/>
+      <w:spacing w:before="40"/>
+      <w:outlineLvl w:val="4"/>
+    </w:pPr>
+    <w:rPr>
+      <w:rFonts w:asciiTheme="majorHAnsi" w:eastAsiaTheme="majorEastAsia" w:hAnsiTheme="majorHAnsi" w:cstheme="majorBidi"/>
+      <w:color w:val="365F91" w:themeColor="accent1" w:themeShade="BF"/>
+    </w:rPr>
+  </w:style>
+  <w:style w:type="paragraph" w:styleId="Heading6">
+    <w:name w:val="heading 6"/>
+    <w:basedOn w:val="Normal"/>
+    <w:next w:val="Normal"/>
+    <w:link w:val="Heading6Char"/>
+    <w:uiPriority w:val="9"/>
+    <w:semiHidden/>
+    <w:unhideWhenUsed/>
+    <w:qFormat/>
+    <w:rsid w:val="008B47AC"/>
+    <w:pPr>
+      <w:keepNext/>
+      <w:keepLines/>
+      <w:spacing w:before="40"/>
+      <w:outlineLvl w:val="5"/>
+    </w:pPr>
+    <w:rPr>
+      <w:rFonts w:asciiTheme="majorHAnsi" w:eastAsiaTheme="majorEastAsia" w:hAnsiTheme="majorHAnsi" w:cstheme="majorBidi"/>
+      <w:color w:val="243F60" w:themeColor="accent1" w:themeShade="7F"/>
+    </w:rPr>
+  </w:style>
+  <w:style w:type="paragraph" w:styleId="Heading7">
+    <w:name w:val="heading 7"/>
+    <w:basedOn w:val="Normal"/>
+    <w:next w:val="Normal"/>
+    <w:link w:val="Heading7Char"/>
+    <w:uiPriority w:val="9"/>
+    <w:semiHidden/>
+    <w:unhideWhenUsed/>
+    <w:qFormat/>
+    <w:rsid w:val="008B47AC"/>
+    <w:pPr>
+      <w:keepNext/>
+      <w:keepLines/>
+      <w:spacing w:before="40"/>
+      <w:outlineLvl w:val="6"/>
+    </w:pPr>
+    <w:rPr>
+      <w:rFonts w:asciiTheme="majorHAnsi" w:eastAsiaTheme="majorEastAsia" w:hAnsiTheme="majorHAnsi" w:cstheme="majorBidi"/>
+      <w:i/>
+      <w:iCs/>
+      <w:color w:val="243F60" w:themeColor="accent1" w:themeShade="7F"/>
+    </w:rPr>
+  </w:style>
+  <w:style w:type="paragraph" w:styleId="Heading8">
+    <w:name w:val="heading 8"/>
+    <w:basedOn w:val="Normal"/>
+    <w:next w:val="Normal"/>
+    <w:link w:val="Heading8Char"/>
+    <w:uiPriority w:val="9"/>
+    <w:semiHidden/>
+    <w:unhideWhenUsed/>
+    <w:qFormat/>
+    <w:rsid w:val="008B47AC"/>
+    <w:pPr>
+      <w:keepNext/>
+      <w:keepLines/>
+      <w:spacing w:before="40"/>
+      <w:outlineLvl w:val="7"/>
+    </w:pPr>
+    <w:rPr>
+      <w:rFonts w:asciiTheme="majorHAnsi" w:eastAsiaTheme="majorEastAsia" w:hAnsiTheme="majorHAnsi" w:cstheme="majorBidi"/>
+      <w:color w:val="272727" w:themeColor="text1" w:themeTint="D8"/>
+      <w:sz w:val="21"/>
+      <w:szCs w:val="21"/>
+    </w:rPr>
+  </w:style>
+  <w:style w:type="paragraph" w:styleId="Heading9">
+    <w:name w:val="heading 9"/>
+    <w:basedOn w:val="Normal"/>
+    <w:next w:val="Normal"/>
+    <w:link w:val="Heading9Char"/>
+    <w:uiPriority w:val="9"/>
+    <w:semiHidden/>
+    <w:unhideWhenUsed/>
+    <w:qFormat/>
+    <w:rsid w:val="008B47AC"/>
+    <w:pPr>
+      <w:keepNext/>
+      <w:keepLines/>
+      <w:spacing w:before="40"/>
+      <w:outlineLvl w:val="8"/>
+    </w:pPr>
+    <w:rPr>
+      <w:rFonts w:asciiTheme="majorHAnsi" w:eastAsiaTheme="majorEastAsia" w:hAnsiTheme="majorHAnsi" w:cstheme="majorBidi"/>
+      <w:i/>
+      <w:iCs/>
+      <w:color w:val="272727" w:themeColor="text1" w:themeTint="D8"/>
+      <w:sz w:val="21"/>
+      <w:szCs w:val="21"/>
+    </w:rPr>
+  </w:style>
   <w:style w:type="character" w:default="1" w:styleId="DefaultParagraphFont">
     <w:name w:val="Default Paragraph Font"/>
     <w:uiPriority w:val="1"/>
@@ -4931,6 +5137,375 @@
       <w:lang w:bidi="en-US"/>
     </w:rPr>
   </w:style>
+  <w:style w:type="character" w:styleId="BookTitle">
+    <w:name w:val="Book Title"/>
+    <w:basedOn w:val="DefaultParagraphFont"/>
+    <w:uiPriority w:val="33"/>
+    <w:qFormat/>
+    <w:rsid w:val="008B47AC"/>
+    <w:rPr>
+      <w:b/>
+      <w:bCs/>
+      <w:i/>
+      <w:iCs/>
+      <w:spacing w:val="5"/>
+    </w:rPr>
+  </w:style>
+  <w:style w:type="paragraph" w:styleId="Caption">
+    <w:name w:val="caption"/>
+    <w:basedOn w:val="Normal"/>
+    <w:next w:val="Normal"/>
+    <w:uiPriority w:val="35"/>
+    <w:semiHidden/>
+    <w:unhideWhenUsed/>
+    <w:qFormat/>
+    <w:rsid w:val="008B47AC"/>
+    <w:pPr>
+      <w:spacing w:after="200"/>
+    </w:pPr>
+    <w:rPr>
+      <w:i/>
+      <w:iCs/>
+      <w:color w:val="1F497D" w:themeColor="text2"/>
+      <w:sz w:val="18"/>
+      <w:szCs w:val="18"/>
+    </w:rPr>
+  </w:style>
+  <w:style w:type="character" w:styleId="Emphasis">
+    <w:name w:val="Emphasis"/>
+    <w:basedOn w:val="DefaultParagraphFont"/>
+    <w:uiPriority w:val="20"/>
+    <w:qFormat/>
+    <w:rsid w:val="008B47AC"/>
+    <w:rPr>
+      <w:i/>
+      <w:iCs/>
+    </w:rPr>
+  </w:style>
+  <w:style w:type="character" w:customStyle="1" w:styleId="Heading3Char">
+    <w:name w:val="Heading 3 Char"/>
+    <w:basedOn w:val="DefaultParagraphFont"/>
+    <w:link w:val="Heading3"/>
+    <w:uiPriority w:val="9"/>
+    <w:semiHidden/>
+    <w:rsid w:val="008B47AC"/>
+    <w:rPr>
+      <w:rFonts w:asciiTheme="majorHAnsi" w:eastAsiaTheme="majorEastAsia" w:hAnsiTheme="majorHAnsi" w:cstheme="majorBidi"/>
+      <w:color w:val="243F60" w:themeColor="accent1" w:themeShade="7F"/>
+      <w:sz w:val="24"/>
+      <w:szCs w:val="24"/>
+      <w:lang w:bidi="en-US"/>
+    </w:rPr>
+  </w:style>
+  <w:style w:type="character" w:customStyle="1" w:styleId="Heading4Char">
+    <w:name w:val="Heading 4 Char"/>
+    <w:basedOn w:val="DefaultParagraphFont"/>
+    <w:link w:val="Heading4"/>
+    <w:uiPriority w:val="9"/>
+    <w:semiHidden/>
+    <w:rsid w:val="008B47AC"/>
+    <w:rPr>
+      <w:rFonts w:asciiTheme="majorHAnsi" w:eastAsiaTheme="majorEastAsia" w:hAnsiTheme="majorHAnsi" w:cstheme="majorBidi"/>
+      <w:i/>
+      <w:iCs/>
+      <w:color w:val="365F91" w:themeColor="accent1" w:themeShade="BF"/>
+      <w:lang w:bidi="en-US"/>
+    </w:rPr>
+  </w:style>
+  <w:style w:type="character" w:customStyle="1" w:styleId="Heading5Char">
+    <w:name w:val="Heading 5 Char"/>
+    <w:basedOn w:val="DefaultParagraphFont"/>
+    <w:link w:val="Heading5"/>
+    <w:uiPriority w:val="9"/>
+    <w:semiHidden/>
+    <w:rsid w:val="008B47AC"/>
+    <w:rPr>
+      <w:rFonts w:asciiTheme="majorHAnsi" w:eastAsiaTheme="majorEastAsia" w:hAnsiTheme="majorHAnsi" w:cstheme="majorBidi"/>
+      <w:color w:val="365F91" w:themeColor="accent1" w:themeShade="BF"/>
+      <w:lang w:bidi="en-US"/>
+    </w:rPr>
+  </w:style>
+  <w:style w:type="character" w:customStyle="1" w:styleId="Heading6Char">
+    <w:name w:val="Heading 6 Char"/>
+    <w:basedOn w:val="DefaultParagraphFont"/>
+    <w:link w:val="Heading6"/>
+    <w:uiPriority w:val="9"/>
+    <w:semiHidden/>
+    <w:rsid w:val="008B47AC"/>
+    <w:rPr>
+      <w:rFonts w:asciiTheme="majorHAnsi" w:eastAsiaTheme="majorEastAsia" w:hAnsiTheme="majorHAnsi" w:cstheme="majorBidi"/>
+      <w:color w:val="243F60" w:themeColor="accent1" w:themeShade="7F"/>
+      <w:lang w:bidi="en-US"/>
+    </w:rPr>
+  </w:style>
+  <w:style w:type="character" w:customStyle="1" w:styleId="Heading7Char">
+    <w:name w:val="Heading 7 Char"/>
+    <w:basedOn w:val="DefaultParagraphFont"/>
+    <w:link w:val="Heading7"/>
+    <w:uiPriority w:val="9"/>
+    <w:semiHidden/>
+    <w:rsid w:val="008B47AC"/>
+    <w:rPr>
+      <w:rFonts w:asciiTheme="majorHAnsi" w:eastAsiaTheme="majorEastAsia" w:hAnsiTheme="majorHAnsi" w:cstheme="majorBidi"/>
+      <w:i/>
+      <w:iCs/>
+      <w:color w:val="243F60" w:themeColor="accent1" w:themeShade="7F"/>
+      <w:lang w:bidi="en-US"/>
+    </w:rPr>
+  </w:style>
+  <w:style w:type="character" w:customStyle="1" w:styleId="Heading8Char">
+    <w:name w:val="Heading 8 Char"/>
+    <w:basedOn w:val="DefaultParagraphFont"/>
+    <w:link w:val="Heading8"/>
+    <w:uiPriority w:val="9"/>
+    <w:semiHidden/>
+    <w:rsid w:val="008B47AC"/>
+    <w:rPr>
+      <w:rFonts w:asciiTheme="majorHAnsi" w:eastAsiaTheme="majorEastAsia" w:hAnsiTheme="majorHAnsi" w:cstheme="majorBidi"/>
+      <w:color w:val="272727" w:themeColor="text1" w:themeTint="D8"/>
+      <w:sz w:val="21"/>
+      <w:szCs w:val="21"/>
+      <w:lang w:bidi="en-US"/>
+    </w:rPr>
+  </w:style>
+  <w:style w:type="character" w:customStyle="1" w:styleId="Heading9Char">
+    <w:name w:val="Heading 9 Char"/>
+    <w:basedOn w:val="DefaultParagraphFont"/>
+    <w:link w:val="Heading9"/>
+    <w:uiPriority w:val="9"/>
+    <w:semiHidden/>
+    <w:rsid w:val="008B47AC"/>
+    <w:rPr>
+      <w:rFonts w:asciiTheme="majorHAnsi" w:eastAsiaTheme="majorEastAsia" w:hAnsiTheme="majorHAnsi" w:cstheme="majorBidi"/>
+      <w:i/>
+      <w:iCs/>
+      <w:color w:val="272727" w:themeColor="text1" w:themeTint="D8"/>
+      <w:sz w:val="21"/>
+      <w:szCs w:val="21"/>
+      <w:lang w:bidi="en-US"/>
+    </w:rPr>
+  </w:style>
+  <w:style w:type="character" w:styleId="IntenseEmphasis">
+    <w:name w:val="Intense Emphasis"/>
+    <w:basedOn w:val="DefaultParagraphFont"/>
+    <w:uiPriority w:val="21"/>
+    <w:qFormat/>
+    <w:rsid w:val="008B47AC"/>
+    <w:rPr>
+      <w:i/>
+      <w:iCs/>
+      <w:color w:val="4F81BD" w:themeColor="accent1"/>
+    </w:rPr>
+  </w:style>
+  <w:style w:type="paragraph" w:styleId="IntenseQuote">
+    <w:name w:val="Intense Quote"/>
+    <w:basedOn w:val="Normal"/>
+    <w:next w:val="Normal"/>
+    <w:link w:val="IntenseQuoteChar"/>
+    <w:uiPriority w:val="30"/>
+    <w:qFormat/>
+    <w:rsid w:val="008B47AC"/>
+    <w:pPr>
+      <w:pBdr>
+        <w:top w:val="single" w:sz="4" w:space="10" w:color="4F81BD" w:themeColor="accent1"/>
+        <w:bottom w:val="single" w:sz="4" w:space="10" w:color="4F81BD" w:themeColor="accent1"/>
+      </w:pBdr>
+      <w:spacing w:before="360" w:after="360"/>
+      <w:ind w:left="864" w:right="864"/>
+      <w:jc w:val="center"/>
+    </w:pPr>
+    <w:rPr>
+      <w:i/>
+      <w:iCs/>
+      <w:color w:val="4F81BD" w:themeColor="accent1"/>
+    </w:rPr>
+  </w:style>
+  <w:style w:type="character" w:customStyle="1" w:styleId="IntenseQuoteChar">
+    <w:name w:val="Intense Quote Char"/>
+    <w:basedOn w:val="DefaultParagraphFont"/>
+    <w:link w:val="IntenseQuote"/>
+    <w:uiPriority w:val="30"/>
+    <w:rsid w:val="008B47AC"/>
+    <w:rPr>
+      <w:rFonts w:ascii="Calibri" w:eastAsia="Calibri" w:hAnsi="Calibri" w:cs="Calibri"/>
+      <w:i/>
+      <w:iCs/>
+      <w:color w:val="4F81BD" w:themeColor="accent1"/>
+      <w:lang w:bidi="en-US"/>
+    </w:rPr>
+  </w:style>
+  <w:style w:type="character" w:styleId="IntenseReference">
+    <w:name w:val="Intense Reference"/>
+    <w:basedOn w:val="DefaultParagraphFont"/>
+    <w:uiPriority w:val="32"/>
+    <w:qFormat/>
+    <w:rsid w:val="008B47AC"/>
+    <w:rPr>
+      <w:b/>
+      <w:bCs/>
+      <w:smallCaps/>
+      <w:color w:val="4F81BD" w:themeColor="accent1"/>
+      <w:spacing w:val="5"/>
+    </w:rPr>
+  </w:style>
+  <w:style w:type="paragraph" w:styleId="NoSpacing">
+    <w:name w:val="No Spacing"/>
+    <w:uiPriority w:val="1"/>
+    <w:qFormat/>
+    <w:rsid w:val="008B47AC"/>
+    <w:rPr>
+      <w:rFonts w:ascii="Calibri" w:eastAsia="Calibri" w:hAnsi="Calibri" w:cs="Calibri"/>
+      <w:lang w:bidi="en-US"/>
+    </w:rPr>
+  </w:style>
+  <w:style w:type="paragraph" w:styleId="Quote">
+    <w:name w:val="Quote"/>
+    <w:basedOn w:val="Normal"/>
+    <w:next w:val="Normal"/>
+    <w:link w:val="QuoteChar"/>
+    <w:uiPriority w:val="29"/>
+    <w:qFormat/>
+    <w:rsid w:val="008B47AC"/>
+    <w:pPr>
+      <w:spacing w:before="200" w:after="160"/>
+      <w:ind w:left="864" w:right="864"/>
+      <w:jc w:val="center"/>
+    </w:pPr>
+    <w:rPr>
+      <w:i/>
+      <w:iCs/>
+      <w:color w:val="404040" w:themeColor="text1" w:themeTint="BF"/>
+    </w:rPr>
+  </w:style>
+  <w:style w:type="character" w:customStyle="1" w:styleId="QuoteChar">
+    <w:name w:val="Quote Char"/>
+    <w:basedOn w:val="DefaultParagraphFont"/>
+    <w:link w:val="Quote"/>
+    <w:uiPriority w:val="29"/>
+    <w:rsid w:val="008B47AC"/>
+    <w:rPr>
+      <w:rFonts w:ascii="Calibri" w:eastAsia="Calibri" w:hAnsi="Calibri" w:cs="Calibri"/>
+      <w:i/>
+      <w:iCs/>
+      <w:color w:val="404040" w:themeColor="text1" w:themeTint="BF"/>
+      <w:lang w:bidi="en-US"/>
+    </w:rPr>
+  </w:style>
+  <w:style w:type="paragraph" w:styleId="Subtitle">
+    <w:name w:val="Subtitle"/>
+    <w:basedOn w:val="Normal"/>
+    <w:next w:val="Normal"/>
+    <w:link w:val="SubtitleChar"/>
+    <w:uiPriority w:val="11"/>
+    <w:qFormat/>
+    <w:rsid w:val="008B47AC"/>
+    <w:pPr>
+      <w:numPr>
+        <w:ilvl w:val="1"/>
+      </w:numPr>
+      <w:spacing w:after="160"/>
+    </w:pPr>
+    <w:rPr>
+      <w:rFonts w:asciiTheme="minorHAnsi" w:eastAsiaTheme="minorEastAsia" w:hAnsiTheme="minorHAnsi" w:cstheme="minorBidi"/>
+      <w:color w:val="5A5A5A" w:themeColor="text1" w:themeTint="A5"/>
+      <w:spacing w:val="15"/>
+    </w:rPr>
+  </w:style>
+  <w:style w:type="character" w:customStyle="1" w:styleId="SubtitleChar">
+    <w:name w:val="Subtitle Char"/>
+    <w:basedOn w:val="DefaultParagraphFont"/>
+    <w:link w:val="Subtitle"/>
+    <w:uiPriority w:val="11"/>
+    <w:rsid w:val="008B47AC"/>
+    <w:rPr>
+      <w:rFonts w:eastAsiaTheme="minorEastAsia"/>
+      <w:color w:val="5A5A5A" w:themeColor="text1" w:themeTint="A5"/>
+      <w:spacing w:val="15"/>
+      <w:lang w:bidi="en-US"/>
+    </w:rPr>
+  </w:style>
+  <w:style w:type="character" w:styleId="SubtleEmphasis">
+    <w:name w:val="Subtle Emphasis"/>
+    <w:basedOn w:val="DefaultParagraphFont"/>
+    <w:uiPriority w:val="19"/>
+    <w:qFormat/>
+    <w:rsid w:val="008B47AC"/>
+    <w:rPr>
+      <w:i/>
+      <w:iCs/>
+      <w:color w:val="404040" w:themeColor="text1" w:themeTint="BF"/>
+    </w:rPr>
+  </w:style>
+  <w:style w:type="character" w:styleId="SubtleReference">
+    <w:name w:val="Subtle Reference"/>
+    <w:basedOn w:val="DefaultParagraphFont"/>
+    <w:uiPriority w:val="31"/>
+    <w:qFormat/>
+    <w:rsid w:val="008B47AC"/>
+    <w:rPr>
+      <w:smallCaps/>
+      <w:color w:val="5A5A5A" w:themeColor="text1" w:themeTint="A5"/>
+    </w:rPr>
+  </w:style>
+  <w:style w:type="paragraph" w:styleId="Title">
+    <w:name w:val="Title"/>
+    <w:basedOn w:val="Normal"/>
+    <w:next w:val="Normal"/>
+    <w:link w:val="TitleChar"/>
+    <w:uiPriority w:val="10"/>
+    <w:qFormat/>
+    <w:rsid w:val="008B47AC"/>
+    <w:pPr>
+      <w:contextualSpacing/>
+    </w:pPr>
+    <w:rPr>
+      <w:rFonts w:asciiTheme="majorHAnsi" w:eastAsiaTheme="majorEastAsia" w:hAnsiTheme="majorHAnsi" w:cstheme="majorBidi"/>
+      <w:spacing w:val="-10"/>
+      <w:kern w:val="28"/>
+      <w:sz w:val="56"/>
+      <w:szCs w:val="56"/>
+    </w:rPr>
+  </w:style>
+  <w:style w:type="character" w:customStyle="1" w:styleId="TitleChar">
+    <w:name w:val="Title Char"/>
+    <w:basedOn w:val="DefaultParagraphFont"/>
+    <w:link w:val="Title"/>
+    <w:uiPriority w:val="10"/>
+    <w:rsid w:val="008B47AC"/>
+    <w:rPr>
+      <w:rFonts w:asciiTheme="majorHAnsi" w:eastAsiaTheme="majorEastAsia" w:hAnsiTheme="majorHAnsi" w:cstheme="majorBidi"/>
+      <w:spacing w:val="-10"/>
+      <w:kern w:val="28"/>
+      <w:sz w:val="56"/>
+      <w:szCs w:val="56"/>
+      <w:lang w:bidi="en-US"/>
+    </w:rPr>
+  </w:style>
+  <w:style w:type="paragraph" w:styleId="TOCHeading">
+    <w:name w:val="TOC Heading"/>
+    <w:basedOn w:val="Heading1"/>
+    <w:next w:val="Normal"/>
+    <w:uiPriority w:val="39"/>
+    <w:semiHidden/>
+    <w:unhideWhenUsed/>
+    <w:qFormat/>
+    <w:rsid w:val="008B47AC"/>
+    <w:pPr>
+      <w:keepNext/>
+      <w:keepLines/>
+      <w:spacing w:before="240"/>
+      <w:ind w:left="0"/>
+      <w:outlineLvl w:val="9"/>
+    </w:pPr>
+    <w:rPr>
+      <w:rFonts w:asciiTheme="majorHAnsi" w:eastAsiaTheme="majorEastAsia" w:hAnsiTheme="majorHAnsi" w:cstheme="majorBidi"/>
+      <w:b w:val="0"/>
+      <w:bCs w:val="0"/>
+      <w:color w:val="365F91" w:themeColor="accent1" w:themeShade="BF"/>
+      <w:sz w:val="32"/>
+      <w:szCs w:val="32"/>
+    </w:rPr>
+  </w:style>
 </w:styles>
 </file>
 
@@ -5218,6 +5793,12 @@
 </file>
 
 <file path=customXml/item1.xml><?xml version="1.0" encoding="utf-8"?>
+<p:properties xmlns:p="http://schemas.microsoft.com/office/2006/metadata/properties" xmlns:xsi="http://www.w3.org/2001/XMLSchema-instance" xmlns:pc="http://schemas.microsoft.com/office/infopath/2007/PartnerControls">
+  <documentManagement/>
+</p:properties>
+</file>
+
+<file path=customXml/item2.xml><?xml version="1.0" encoding="utf-8"?>
 <?mso-contentType ?>
 <FormTemplates xmlns="http://schemas.microsoft.com/sharepoint/v3/contenttype/forms">
   <Display>DocumentLibraryForm</Display>
@@ -5226,13 +5807,11 @@
 </FormTemplates>
 </file>
 
-<file path=customXml/item2.xml><?xml version="1.0" encoding="utf-8"?>
-<p:properties xmlns:p="http://schemas.microsoft.com/office/2006/metadata/properties" xmlns:xsi="http://www.w3.org/2001/XMLSchema-instance" xmlns:pc="http://schemas.microsoft.com/office/infopath/2007/PartnerControls">
-  <documentManagement/>
-</p:properties>
+<file path=customXml/item3.xml><?xml version="1.0" encoding="utf-8"?>
+<b:Sources xmlns:b="http://schemas.openxmlformats.org/officeDocument/2006/bibliography" xmlns="http://schemas.openxmlformats.org/officeDocument/2006/bibliography" SelectedStyle="\APASixthEditionOfficeOnline.xsl" StyleName="APA" Version="6"/>
 </file>
 
-<file path=customXml/item3.xml><?xml version="1.0" encoding="utf-8"?>
+<file path=customXml/item4.xml><?xml version="1.0" encoding="utf-8"?>
 <ct:contentTypeSchema xmlns:ct="http://schemas.microsoft.com/office/2006/metadata/contentType" xmlns:ma="http://schemas.microsoft.com/office/2006/metadata/properties/metaAttributes" ct:_="" ma:_="" ma:contentTypeName="Document" ma:contentTypeID="0x010100C62E9F8080EF9045A3461589C8C739D0" ma:contentTypeVersion="12" ma:contentTypeDescription="Create a new document." ma:contentTypeScope="" ma:versionID="b82a4e0cfbba1a4e0025dcf5a4615212">
   <xsd:schema xmlns:xsd="http://www.w3.org/2001/XMLSchema" xmlns:xs="http://www.w3.org/2001/XMLSchema" xmlns:p="http://schemas.microsoft.com/office/2006/metadata/properties" xmlns:ns3="9237417f-6a90-4707-b345-f61fa45bd513" xmlns:ns4="9a6bc8ff-0751-4fb5-b019-c7731e2305e0" targetNamespace="http://schemas.microsoft.com/office/2006/metadata/properties" ma:root="true" ma:fieldsID="8962f9b60b26a87ae6d308e6e9d5b6bd" ns3:_="" ns4:_="">
     <xsd:import namespace="9237417f-6a90-4707-b345-f61fa45bd513"/>
@@ -5449,19 +6028,7 @@
 </ct:contentTypeSchema>
 </file>
 
-<file path=customXml/item4.xml><?xml version="1.0" encoding="utf-8"?>
-<b:Sources xmlns:b="http://schemas.openxmlformats.org/officeDocument/2006/bibliography" xmlns="http://schemas.openxmlformats.org/officeDocument/2006/bibliography" SelectedStyle="\APASixthEditionOfficeOnline.xsl" StyleName="APA" Version="6"/>
-</file>
-
 <file path=customXml/itemProps1.xml><?xml version="1.0" encoding="utf-8"?>
-<ds:datastoreItem xmlns:ds="http://schemas.openxmlformats.org/officeDocument/2006/customXml" ds:itemID="{A6C65B34-06ED-41A8-A3F3-05A1F92025D0}">
-  <ds:schemaRefs>
-    <ds:schemaRef ds:uri="http://schemas.microsoft.com/sharepoint/v3/contenttype/forms"/>
-  </ds:schemaRefs>
-</ds:datastoreItem>
-</file>
-
-<file path=customXml/itemProps2.xml><?xml version="1.0" encoding="utf-8"?>
 <ds:datastoreItem xmlns:ds="http://schemas.openxmlformats.org/officeDocument/2006/customXml" ds:itemID="{83F54608-22A7-4AF5-943D-E29461CC7B4C}">
   <ds:schemaRefs>
     <ds:schemaRef ds:uri="http://schemas.microsoft.com/office/2006/metadata/properties"/>
@@ -5470,7 +6037,23 @@
 </ds:datastoreItem>
 </file>
 
+<file path=customXml/itemProps2.xml><?xml version="1.0" encoding="utf-8"?>
+<ds:datastoreItem xmlns:ds="http://schemas.openxmlformats.org/officeDocument/2006/customXml" ds:itemID="{A6C65B34-06ED-41A8-A3F3-05A1F92025D0}">
+  <ds:schemaRefs>
+    <ds:schemaRef ds:uri="http://schemas.microsoft.com/sharepoint/v3/contenttype/forms"/>
+  </ds:schemaRefs>
+</ds:datastoreItem>
+</file>
+
 <file path=customXml/itemProps3.xml><?xml version="1.0" encoding="utf-8"?>
+<ds:datastoreItem xmlns:ds="http://schemas.openxmlformats.org/officeDocument/2006/customXml" ds:itemID="{CC3DF9CB-EAE3-4358-B00B-AEDD1725FC02}">
+  <ds:schemaRefs>
+    <ds:schemaRef ds:uri="http://schemas.openxmlformats.org/officeDocument/2006/bibliography"/>
+  </ds:schemaRefs>
+</ds:datastoreItem>
+</file>
+
+<file path=customXml/itemProps4.xml><?xml version="1.0" encoding="utf-8"?>
 <ds:datastoreItem xmlns:ds="http://schemas.openxmlformats.org/officeDocument/2006/customXml" ds:itemID="{2993B305-E746-423D-81B7-32926B0D6054}">
   <ds:schemaRefs>
     <ds:schemaRef ds:uri="http://schemas.microsoft.com/office/2006/metadata/contentType"/>
@@ -5487,12 +6070,4 @@
     <ds:schemaRef ds:uri="http://schemas.microsoft.com/internal/obd"/>
   </ds:schemaRefs>
 </ds:datastoreItem>
-</file>
-
-<file path=customXml/itemProps4.xml><?xml version="1.0" encoding="utf-8"?>
-<ds:datastoreItem xmlns:ds="http://schemas.openxmlformats.org/officeDocument/2006/customXml" ds:itemID="{CC3DF9CB-EAE3-4358-B00B-AEDD1725FC02}">
-  <ds:schemaRefs>
-    <ds:schemaRef ds:uri="http://schemas.openxmlformats.org/officeDocument/2006/bibliography"/>
-  </ds:schemaRefs>
-</ds:datastoreItem>
 </file>
</xml_diff>